<commit_message>
add video link to the word document and update pdf
</commit_message>
<xml_diff>
--- a/Documents/Auto Rentals.docx
+++ b/Documents/Auto Rentals.docx
@@ -156,25 +156,7 @@
           <w:sz w:val="28"/>
           <w:szCs w:val="28"/>
         </w:rPr>
-        <w:t xml:space="preserve">Vehicle </w:t>
-      </w:r>
-      <w:proofErr w:type="gramStart"/>
-      <w:r>
-        <w:rPr>
-          <w:rFonts w:asciiTheme="majorBidi" w:hAnsiTheme="majorBidi" w:cstheme="majorBidi"/>
-          <w:sz w:val="28"/>
-          <w:szCs w:val="28"/>
-        </w:rPr>
-        <w:t>listing</w:t>
-      </w:r>
-      <w:proofErr w:type="gramEnd"/>
-      <w:r>
-        <w:rPr>
-          <w:rFonts w:asciiTheme="majorBidi" w:hAnsiTheme="majorBidi" w:cstheme="majorBidi"/>
-          <w:sz w:val="28"/>
-          <w:szCs w:val="28"/>
-        </w:rPr>
-        <w:t xml:space="preserve"> management (CRUD) </w:t>
+        <w:t xml:space="preserve">Vehicle listing management (CRUD) </w:t>
       </w:r>
     </w:p>
     <w:p>
@@ -539,16 +521,7 @@
           <w:sz w:val="28"/>
           <w:szCs w:val="28"/>
         </w:rPr>
-        <w:t>As a user</w:t>
-      </w:r>
-      <w:proofErr w:type="gramStart"/>
-      <w:r>
-        <w:rPr>
-          <w:rFonts w:asciiTheme="majorBidi" w:hAnsiTheme="majorBidi" w:cstheme="majorBidi"/>
-          <w:sz w:val="28"/>
-          <w:szCs w:val="28"/>
-        </w:rPr>
-        <w:t xml:space="preserve">, </w:t>
+        <w:t xml:space="preserve">As a user, </w:t>
       </w:r>
       <w:r>
         <w:rPr>
@@ -564,16 +537,7 @@
           <w:sz w:val="28"/>
           <w:szCs w:val="28"/>
         </w:rPr>
-        <w:t>I</w:t>
-      </w:r>
-      <w:proofErr w:type="gramEnd"/>
-      <w:r>
-        <w:rPr>
-          <w:rFonts w:asciiTheme="majorBidi" w:hAnsiTheme="majorBidi" w:cstheme="majorBidi"/>
-          <w:sz w:val="28"/>
-          <w:szCs w:val="28"/>
-        </w:rPr>
-        <w:t xml:space="preserve"> want to register/login </w:t>
+        <w:t xml:space="preserve">I want to register/login </w:t>
       </w:r>
       <w:r>
         <w:rPr>
@@ -611,16 +575,7 @@
           <w:sz w:val="28"/>
           <w:szCs w:val="28"/>
         </w:rPr>
-        <w:t>As an owner</w:t>
-      </w:r>
-      <w:proofErr w:type="gramStart"/>
-      <w:r>
-        <w:rPr>
-          <w:rFonts w:asciiTheme="majorBidi" w:hAnsiTheme="majorBidi" w:cstheme="majorBidi"/>
-          <w:sz w:val="28"/>
-          <w:szCs w:val="28"/>
-        </w:rPr>
-        <w:t xml:space="preserve">, </w:t>
+        <w:t xml:space="preserve">As an owner, </w:t>
       </w:r>
       <w:r>
         <w:rPr>
@@ -636,16 +591,7 @@
           <w:sz w:val="28"/>
           <w:szCs w:val="28"/>
         </w:rPr>
-        <w:t>I</w:t>
-      </w:r>
-      <w:proofErr w:type="gramEnd"/>
-      <w:r>
-        <w:rPr>
-          <w:rFonts w:asciiTheme="majorBidi" w:hAnsiTheme="majorBidi" w:cstheme="majorBidi"/>
-          <w:sz w:val="28"/>
-          <w:szCs w:val="28"/>
-        </w:rPr>
-        <w:t xml:space="preserve"> want to list my car </w:t>
+        <w:t xml:space="preserve">I want to list my car </w:t>
       </w:r>
       <w:r>
         <w:rPr>
@@ -683,16 +629,7 @@
           <w:sz w:val="28"/>
           <w:szCs w:val="28"/>
         </w:rPr>
-        <w:t>As a renter</w:t>
-      </w:r>
-      <w:proofErr w:type="gramStart"/>
-      <w:r>
-        <w:rPr>
-          <w:rFonts w:asciiTheme="majorBidi" w:hAnsiTheme="majorBidi" w:cstheme="majorBidi"/>
-          <w:sz w:val="28"/>
-          <w:szCs w:val="28"/>
-        </w:rPr>
-        <w:t xml:space="preserve">, </w:t>
+        <w:t xml:space="preserve">As a renter, </w:t>
       </w:r>
       <w:r>
         <w:rPr>
@@ -708,16 +645,7 @@
           <w:sz w:val="28"/>
           <w:szCs w:val="28"/>
         </w:rPr>
-        <w:t>I</w:t>
-      </w:r>
-      <w:proofErr w:type="gramEnd"/>
-      <w:r>
-        <w:rPr>
-          <w:rFonts w:asciiTheme="majorBidi" w:hAnsiTheme="majorBidi" w:cstheme="majorBidi"/>
-          <w:sz w:val="28"/>
-          <w:szCs w:val="28"/>
-        </w:rPr>
-        <w:t xml:space="preserve"> want to search for cars </w:t>
+        <w:t xml:space="preserve">I want to search for cars </w:t>
       </w:r>
       <w:r>
         <w:rPr>
@@ -755,16 +683,7 @@
           <w:sz w:val="28"/>
           <w:szCs w:val="28"/>
         </w:rPr>
-        <w:t>As a renter</w:t>
-      </w:r>
-      <w:proofErr w:type="gramStart"/>
-      <w:r>
-        <w:rPr>
-          <w:rFonts w:asciiTheme="majorBidi" w:hAnsiTheme="majorBidi" w:cstheme="majorBidi"/>
-          <w:sz w:val="28"/>
-          <w:szCs w:val="28"/>
-        </w:rPr>
-        <w:t xml:space="preserve">, </w:t>
+        <w:t xml:space="preserve">As a renter, </w:t>
       </w:r>
       <w:r>
         <w:rPr>
@@ -780,16 +699,7 @@
           <w:sz w:val="28"/>
           <w:szCs w:val="28"/>
         </w:rPr>
-        <w:t>I</w:t>
-      </w:r>
-      <w:proofErr w:type="gramEnd"/>
-      <w:r>
-        <w:rPr>
-          <w:rFonts w:asciiTheme="majorBidi" w:hAnsiTheme="majorBidi" w:cstheme="majorBidi"/>
-          <w:sz w:val="28"/>
-          <w:szCs w:val="28"/>
-        </w:rPr>
-        <w:t xml:space="preserve"> want to book a car </w:t>
+        <w:t xml:space="preserve">I want to book a car </w:t>
       </w:r>
       <w:r>
         <w:rPr>
@@ -827,16 +737,7 @@
           <w:sz w:val="28"/>
           <w:szCs w:val="28"/>
         </w:rPr>
-        <w:t>As a user</w:t>
-      </w:r>
-      <w:proofErr w:type="gramStart"/>
-      <w:r>
-        <w:rPr>
-          <w:rFonts w:asciiTheme="majorBidi" w:hAnsiTheme="majorBidi" w:cstheme="majorBidi"/>
-          <w:sz w:val="28"/>
-          <w:szCs w:val="28"/>
-        </w:rPr>
-        <w:t xml:space="preserve">, </w:t>
+        <w:t xml:space="preserve">As a user, </w:t>
       </w:r>
       <w:r>
         <w:rPr>
@@ -852,34 +753,7 @@
           <w:sz w:val="28"/>
           <w:szCs w:val="28"/>
         </w:rPr>
-        <w:t>I</w:t>
-      </w:r>
-      <w:proofErr w:type="gramEnd"/>
-      <w:r>
-        <w:rPr>
-          <w:rFonts w:asciiTheme="majorBidi" w:hAnsiTheme="majorBidi" w:cstheme="majorBidi"/>
-          <w:sz w:val="28"/>
-          <w:szCs w:val="28"/>
-        </w:rPr>
-        <w:t xml:space="preserve"> want to see </w:t>
-      </w:r>
-      <w:proofErr w:type="gramStart"/>
-      <w:r>
-        <w:rPr>
-          <w:rFonts w:asciiTheme="majorBidi" w:hAnsiTheme="majorBidi" w:cstheme="majorBidi"/>
-          <w:sz w:val="28"/>
-          <w:szCs w:val="28"/>
-        </w:rPr>
-        <w:t>availability</w:t>
-      </w:r>
-      <w:proofErr w:type="gramEnd"/>
-      <w:r>
-        <w:rPr>
-          <w:rFonts w:asciiTheme="majorBidi" w:hAnsiTheme="majorBidi" w:cstheme="majorBidi"/>
-          <w:sz w:val="28"/>
-          <w:szCs w:val="28"/>
-        </w:rPr>
-        <w:t xml:space="preserve"> </w:t>
+        <w:t xml:space="preserve">I want to see availability </w:t>
       </w:r>
       <w:r>
         <w:rPr>
@@ -917,16 +791,7 @@
           <w:sz w:val="28"/>
           <w:szCs w:val="28"/>
         </w:rPr>
-        <w:t>As an admin</w:t>
-      </w:r>
-      <w:proofErr w:type="gramStart"/>
-      <w:r>
-        <w:rPr>
-          <w:rFonts w:asciiTheme="majorBidi" w:hAnsiTheme="majorBidi" w:cstheme="majorBidi"/>
-          <w:sz w:val="28"/>
-          <w:szCs w:val="28"/>
-        </w:rPr>
-        <w:t xml:space="preserve">, </w:t>
+        <w:t xml:space="preserve">As an admin, </w:t>
       </w:r>
       <w:r>
         <w:rPr>
@@ -942,16 +807,7 @@
           <w:sz w:val="28"/>
           <w:szCs w:val="28"/>
         </w:rPr>
-        <w:t>I</w:t>
-      </w:r>
-      <w:proofErr w:type="gramEnd"/>
-      <w:r>
-        <w:rPr>
-          <w:rFonts w:asciiTheme="majorBidi" w:hAnsiTheme="majorBidi" w:cstheme="majorBidi"/>
-          <w:sz w:val="28"/>
-          <w:szCs w:val="28"/>
-        </w:rPr>
-        <w:t xml:space="preserve"> want to manage users/listings</w:t>
+        <w:t>I want to manage users/listings</w:t>
       </w:r>
     </w:p>
     <w:p>
@@ -1077,7 +933,6 @@
         </w:rPr>
         <w:t xml:space="preserve">: </w:t>
       </w:r>
-      <w:proofErr w:type="gramStart"/>
       <w:r>
         <w:rPr>
           <w:rFonts w:asciiTheme="majorBidi" w:hAnsiTheme="majorBidi" w:cstheme="majorBidi"/>
@@ -1102,7 +957,6 @@
         </w:rPr>
         <w:t>caching</w:t>
       </w:r>
-      <w:proofErr w:type="gramEnd"/>
     </w:p>
     <w:p>
       <w:pPr>
@@ -1133,7 +987,6 @@
         </w:rPr>
         <w:t xml:space="preserve">: </w:t>
       </w:r>
-      <w:proofErr w:type="gramStart"/>
       <w:r>
         <w:rPr>
           <w:rFonts w:asciiTheme="majorBidi" w:hAnsiTheme="majorBidi" w:cstheme="majorBidi"/>
@@ -1156,16 +1009,7 @@
           <w:sz w:val="28"/>
           <w:szCs w:val="28"/>
         </w:rPr>
-        <w:t>retries</w:t>
-      </w:r>
-      <w:proofErr w:type="gramEnd"/>
-      <w:r>
-        <w:rPr>
-          <w:rFonts w:asciiTheme="majorBidi" w:hAnsiTheme="majorBidi" w:cstheme="majorBidi"/>
-          <w:sz w:val="28"/>
-          <w:szCs w:val="28"/>
-        </w:rPr>
-        <w:t xml:space="preserve"> </w:t>
+        <w:t xml:space="preserve">retries </w:t>
       </w:r>
       <w:r>
         <w:rPr>
@@ -2201,25 +2045,7 @@
           <w:sz w:val="28"/>
           <w:szCs w:val="28"/>
         </w:rPr>
-        <w:t>Decision: Use modular monolith architecture (</w:t>
-      </w:r>
-      <w:proofErr w:type="gramStart"/>
-      <w:r>
-        <w:rPr>
-          <w:rFonts w:asciiTheme="majorBidi" w:hAnsiTheme="majorBidi" w:cstheme="majorBidi"/>
-          <w:sz w:val="28"/>
-          <w:szCs w:val="28"/>
-        </w:rPr>
-        <w:t>microservices-ready</w:t>
-      </w:r>
-      <w:proofErr w:type="gramEnd"/>
-      <w:r>
-        <w:rPr>
-          <w:rFonts w:asciiTheme="majorBidi" w:hAnsiTheme="majorBidi" w:cstheme="majorBidi"/>
-          <w:sz w:val="28"/>
-          <w:szCs w:val="28"/>
-        </w:rPr>
-        <w:t>).</w:t>
+        <w:t>Decision: Use modular monolith architecture (microservices-ready).</w:t>
       </w:r>
     </w:p>
     <w:p>
@@ -2794,23 +2620,13 @@
           <w:szCs w:val="28"/>
         </w:rPr>
       </w:pPr>
-      <w:proofErr w:type="gramStart"/>
-      <w:r>
-        <w:rPr>
-          <w:rFonts w:asciiTheme="majorBidi" w:hAnsiTheme="majorBidi" w:cstheme="majorBidi"/>
-          <w:sz w:val="28"/>
-          <w:szCs w:val="28"/>
-        </w:rPr>
-        <w:t>Improves</w:t>
-      </w:r>
-      <w:proofErr w:type="gramEnd"/>
-      <w:r>
-        <w:rPr>
-          <w:rFonts w:asciiTheme="majorBidi" w:hAnsiTheme="majorBidi" w:cstheme="majorBidi"/>
-          <w:sz w:val="28"/>
-          <w:szCs w:val="28"/>
-        </w:rPr>
-        <w:t xml:space="preserve"> scalability</w:t>
+      <w:r>
+        <w:rPr>
+          <w:rFonts w:asciiTheme="majorBidi" w:hAnsiTheme="majorBidi" w:cstheme="majorBidi"/>
+          <w:sz w:val="28"/>
+          <w:szCs w:val="28"/>
+        </w:rPr>
+        <w:t>Improves scalability</w:t>
       </w:r>
     </w:p>
     <w:p>
@@ -3921,23 +3737,13 @@
           <w:szCs w:val="28"/>
         </w:rPr>
       </w:pPr>
-      <w:proofErr w:type="spellStart"/>
-      <w:r>
-        <w:rPr>
-          <w:rFonts w:asciiTheme="majorBidi" w:hAnsiTheme="majorBidi" w:cstheme="majorBidi"/>
-          <w:sz w:val="28"/>
-          <w:szCs w:val="28"/>
-        </w:rPr>
-        <w:t>OpenAPI</w:t>
-      </w:r>
-      <w:proofErr w:type="spellEnd"/>
-      <w:r>
-        <w:rPr>
-          <w:rFonts w:asciiTheme="majorBidi" w:hAnsiTheme="majorBidi" w:cstheme="majorBidi"/>
-          <w:sz w:val="28"/>
-          <w:szCs w:val="28"/>
-        </w:rPr>
-        <w:t xml:space="preserve"> </w:t>
+      <w:r>
+        <w:rPr>
+          <w:rFonts w:asciiTheme="majorBidi" w:hAnsiTheme="majorBidi" w:cstheme="majorBidi"/>
+          <w:sz w:val="28"/>
+          <w:szCs w:val="28"/>
+        </w:rPr>
+        <w:t xml:space="preserve">OpenAPI </w:t>
       </w:r>
       <w:r>
         <w:rPr>
@@ -4446,40 +4252,9 @@
           <w:sz w:val="32"/>
           <w:szCs w:val="32"/>
         </w:rPr>
-        <w:t>Presentation link</w:t>
-      </w:r>
-    </w:p>
-    <w:p>
-      <w:pPr>
-        <w:jc w:val="center"/>
-        <w:rPr>
-          <w:rFonts w:asciiTheme="majorBidi" w:hAnsiTheme="majorBidi" w:cstheme="majorBidi"/>
-          <w:sz w:val="28"/>
-          <w:szCs w:val="28"/>
-        </w:rPr>
-      </w:pPr>
-      <w:r>
-        <w:rPr>
-          <w:rFonts w:asciiTheme="majorBidi" w:hAnsiTheme="majorBidi" w:cstheme="majorBidi"/>
-          <w:sz w:val="28"/>
-          <w:szCs w:val="28"/>
-        </w:rPr>
-        <w:t>Http link</w:t>
-      </w:r>
-    </w:p>
-    <w:p>
-      <w:pPr>
-        <w:jc w:val="center"/>
-        <w:rPr>
-          <w:rFonts w:asciiTheme="majorBidi" w:hAnsiTheme="majorBidi" w:cstheme="majorBidi"/>
-          <w:sz w:val="28"/>
-          <w:szCs w:val="28"/>
-          <w:rtl/>
-        </w:rPr>
-      </w:pPr>
-    </w:p>
-    <w:p>
-      <w:pPr>
+        <w:t>Video</w:t>
+      </w:r>
+      <w:r>
         <w:rPr>
           <w:rFonts w:asciiTheme="majorBidi" w:hAnsiTheme="majorBidi" w:cstheme="majorBidi"/>
           <w:b/>
@@ -4487,8 +4262,41 @@
           <w:sz w:val="32"/>
           <w:szCs w:val="32"/>
         </w:rPr>
-      </w:pPr>
-      <w:r>
+        <w:t xml:space="preserve"> link</w:t>
+      </w:r>
+    </w:p>
+    <w:p>
+      <w:pPr>
+        <w:jc w:val="center"/>
+        <w:rPr>
+          <w:rFonts w:asciiTheme="majorBidi" w:hAnsiTheme="majorBidi" w:cstheme="majorBidi"/>
+          <w:sz w:val="28"/>
+          <w:szCs w:val="28"/>
+          <w:rtl/>
+        </w:rPr>
+      </w:pPr>
+      <w:hyperlink r:id="rId7" w:history="1">
+        <w:r>
+          <w:rPr>
+            <w:rStyle w:val="Hyperlink"/>
+            <w:rFonts w:asciiTheme="majorBidi" w:hAnsiTheme="majorBidi" w:cstheme="majorBidi"/>
+            <w:sz w:val="28"/>
+            <w:szCs w:val="28"/>
+          </w:rPr>
+          <w:t>https://drive.google.com/file/d/1h0uHPd--ArVdo70DL1T3GQsEp3BLzsYa/view?usp=sharing</w:t>
+        </w:r>
+      </w:hyperlink>
+      <w:r>
+        <w:rPr>
+          <w:rFonts w:asciiTheme="majorBidi" w:hAnsiTheme="majorBidi" w:cstheme="majorBidi"/>
+          <w:sz w:val="28"/>
+          <w:szCs w:val="28"/>
+        </w:rPr>
+        <w:t xml:space="preserve"> </w:t>
+      </w:r>
+    </w:p>
+    <w:p>
+      <w:pPr>
         <w:rPr>
           <w:rFonts w:asciiTheme="majorBidi" w:hAnsiTheme="majorBidi" w:cstheme="majorBidi"/>
           <w:b/>
@@ -4496,6 +4304,15 @@
           <w:sz w:val="32"/>
           <w:szCs w:val="32"/>
         </w:rPr>
+      </w:pPr>
+      <w:r>
+        <w:rPr>
+          <w:rFonts w:asciiTheme="majorBidi" w:hAnsiTheme="majorBidi" w:cstheme="majorBidi"/>
+          <w:b/>
+          <w:bCs/>
+          <w:sz w:val="32"/>
+          <w:szCs w:val="32"/>
+        </w:rPr>
         <w:t>GitHub Repo link</w:t>
       </w:r>
     </w:p>
@@ -4508,7 +4325,7 @@
           <w:szCs w:val="28"/>
         </w:rPr>
       </w:pPr>
-      <w:hyperlink r:id="rId7" w:history="1">
+      <w:hyperlink r:id="rId8" w:history="1">
         <w:r>
           <w:rPr>
             <w:rStyle w:val="Hyperlink"/>

</xml_diff>